<commit_message>
fix(web): review findings on the Word preview (T067)
- A picture the CV does not describe gets a translated description, and
  only PNG, JPEG and GIF pictures are shown: DOMPurify lets any data: URI
  through on an image, so the type is checked after cleaning.
- The page scrolls by keyboard: its scroller takes focus, since the CV's
  links are made inert and nothing inside it can.
- A conversion is kept by the file's stable link, so a refresh, which
  signs a new link, does not download and convert the file again.
- A different file shows as preparing until its own result arrives.
- The fixture now has a table, an undescribed PNG and a TIFF.

Co-Authored-By: Claude Opus 5.5 <noreply@anthropic.com>
</commit_message>
<xml_diff>
--- a/web/tests/fixtures/syn-cv.docx
+++ b/web/tests/fixtures/syn-cv.docx
@@ -8,6 +8,42 @@
       </w:pPr>
       <w:r>
         <w:t>سارة نبيل</w:t>
+      </w:r>
+    </w:p>
+    <w:p>
+      <w:r>
+        <w:drawing>
+          <wp:inline xmlns:a="http://schemas.openxmlformats.org/drawingml/2006/main" xmlns:pic="http://schemas.openxmlformats.org/drawingml/2006/picture">
+            <wp:extent cx="101600" cy="101600"/>
+            <wp:docPr id="1" name="Picture 1"/>
+            <wp:cNvGraphicFramePr>
+              <a:graphicFrameLocks noChangeAspect="1"/>
+            </wp:cNvGraphicFramePr>
+            <a:graphic>
+              <a:graphicData uri="http://schemas.openxmlformats.org/drawingml/2006/picture">
+                <pic:pic>
+                  <pic:nvPicPr>
+                    <pic:cNvPr id="0" name="image.png"/>
+                    <pic:cNvPicPr/>
+                  </pic:nvPicPr>
+                  <pic:blipFill>
+                    <a:blip r:embed="rId9"/>
+                    <a:stretch>
+                      <a:fillRect/>
+                    </a:stretch>
+                  </pic:blipFill>
+                  <pic:spPr>
+                    <a:xfrm>
+                      <a:off x="0" y="0"/>
+                      <a:ext cx="101600" cy="101600"/>
+                    </a:xfrm>
+                    <a:prstGeom prst="rect"/>
+                  </pic:spPr>
+                </pic:pic>
+              </a:graphicData>
+            </a:graphic>
+          </wp:inline>
+        </w:drawing>
       </w:r>
     </w:p>
     <w:p>
@@ -36,11 +72,101 @@
         <w:t>Prepared the quarterly IFRS reports.</w:t>
       </w:r>
     </w:p>
+    <w:tbl>
+      <w:tblPr>
+        <w:tblW w:type="auto" w:w="0"/>
+        <w:tblLook w:firstColumn="1" w:firstRow="1" w:lastColumn="0" w:lastRow="0" w:noHBand="0" w:noVBand="1" w:val="04A0"/>
+      </w:tblPr>
+      <w:tblGrid>
+        <w:gridCol w:w="4320"/>
+        <w:gridCol w:w="4320"/>
+      </w:tblGrid>
+      <w:tr>
+        <w:tc>
+          <w:tcPr>
+            <w:tcW w:type="dxa" w:w="4320"/>
+          </w:tcPr>
+          <w:p>
+            <w:r>
+              <w:t>اللغة</w:t>
+            </w:r>
+          </w:p>
+        </w:tc>
+        <w:tc>
+          <w:tcPr>
+            <w:tcW w:type="dxa" w:w="4320"/>
+          </w:tcPr>
+          <w:p>
+            <w:r>
+              <w:t>Level</w:t>
+            </w:r>
+          </w:p>
+        </w:tc>
+      </w:tr>
+      <w:tr>
+        <w:tc>
+          <w:tcPr>
+            <w:tcW w:type="dxa" w:w="4320"/>
+          </w:tcPr>
+          <w:p>
+            <w:r>
+              <w:t>English</w:t>
+            </w:r>
+          </w:p>
+        </w:tc>
+        <w:tc>
+          <w:tcPr>
+            <w:tcW w:type="dxa" w:w="4320"/>
+          </w:tcPr>
+          <w:p>
+            <w:r>
+              <w:t>Fluent</w:t>
+            </w:r>
+          </w:p>
+        </w:tc>
+      </w:tr>
+    </w:tbl>
+    <w:p>
+      <w:r>
+        <w:drawing>
+          <wp:inline xmlns:a="http://schemas.openxmlformats.org/drawingml/2006/main" xmlns:pic="http://schemas.openxmlformats.org/drawingml/2006/picture">
+            <wp:extent cx="101600" cy="101600"/>
+            <wp:docPr id="2" name="Picture 2"/>
+            <wp:cNvGraphicFramePr>
+              <a:graphicFrameLocks noChangeAspect="1"/>
+            </wp:cNvGraphicFramePr>
+            <a:graphic>
+              <a:graphicData uri="http://schemas.openxmlformats.org/drawingml/2006/picture">
+                <pic:pic>
+                  <pic:nvPicPr>
+                    <pic:cNvPr id="0" name="image.tiff"/>
+                    <pic:cNvPicPr/>
+                  </pic:nvPicPr>
+                  <pic:blipFill>
+                    <a:blip r:embed="rId10"/>
+                    <a:stretch>
+                      <a:fillRect/>
+                    </a:stretch>
+                  </pic:blipFill>
+                  <pic:spPr>
+                    <a:xfrm>
+                      <a:off x="0" y="0"/>
+                      <a:ext cx="101600" cy="101600"/>
+                    </a:xfrm>
+                    <a:prstGeom prst="rect"/>
+                  </pic:spPr>
+                </pic:pic>
+              </a:graphicData>
+            </a:graphic>
+          </wp:inline>
+        </w:drawing>
+      </w:r>
+    </w:p>
     <w:p>
       <w:r>
         <w:t xml:space="preserve">Portfolio: </w:t>
       </w:r>
-      <w:hyperlink r:id="rId9">
+      <w:hyperlink r:id="rId11">
         <w:r>
           <w:t>my work</w:t>
         </w:r>

</xml_diff>